<commit_message>
docs: add P1 gate function list to test plan, fix col-0 word wrap
</commit_message>
<xml_diff>
--- a/test_strategy_phase1.docx
+++ b/test_strategy_phase1.docx
@@ -655,8 +655,6 @@
                 <w:sz w:val="24"/>
                 <w:noProof/>
               </w:rPr>
-            </w:r>
-            <w:r>
               <w:t>15</w:t>
             </w:r>
           </w:p>
@@ -750,7 +748,7 @@
                 <w:sz w:val="24"/>
                 <w:noProof/>
               </w:rPr>
-              <w:t>10</w:t>
+              <w:t>21</w:t>
             </w:r>
           </w:p>
         </w:tc>
@@ -843,7 +841,7 @@
                 <w:sz w:val="24"/>
                 <w:noProof/>
               </w:rPr>
-              <w:t>8</w:t>
+              <w:t>15</w:t>
             </w:r>
           </w:p>
         </w:tc>
@@ -7197,9 +7195,9 @@
         </w:tblBorders>
       </w:tblPr>
       <w:tblGrid>
-        <w:gridCol w:w="3512"/>
+        <w:gridCol w:w="3392"/>
         <w:gridCol w:w="1134"/>
-        <w:gridCol w:w="4425"/>
+        <w:gridCol w:w="4545"/>
       </w:tblGrid>
       <w:tr>
         <w:trPr>
@@ -7207,7 +7205,7 @@
         </w:trPr>
         <w:tc>
           <w:tcPr>
-            <w:tcW w:w="3512" w:type="dxa"/>
+            <w:tcW w:w="3392" w:type="dxa"/>
           </w:tcPr>
           <w:p>
             <w:pPr>
@@ -7251,7 +7249,7 @@
         </w:tc>
         <w:tc>
           <w:tcPr>
-            <w:tcW w:w="4425" w:type="dxa"/>
+            <w:tcW w:w="4545" w:type="dxa"/>
           </w:tcPr>
           <w:p>
             <w:pPr>
@@ -7278,7 +7276,7 @@
         </w:trPr>
         <w:tc>
           <w:tcPr>
-            <w:tcW w:w="3512" w:type="dxa"/>
+            <w:tcW w:w="3392" w:type="dxa"/>
           </w:tcPr>
           <w:p>
             <w:pPr>
@@ -7322,7 +7320,7 @@
         </w:tc>
         <w:tc>
           <w:tcPr>
-            <w:tcW w:w="4425" w:type="dxa"/>
+            <w:tcW w:w="4545" w:type="dxa"/>
           </w:tcPr>
           <w:p>
             <w:pPr>
@@ -7349,7 +7347,7 @@
         </w:trPr>
         <w:tc>
           <w:tcPr>
-            <w:tcW w:w="3512" w:type="dxa"/>
+            <w:tcW w:w="3392" w:type="dxa"/>
           </w:tcPr>
           <w:p>
             <w:pPr>
@@ -7393,7 +7391,7 @@
         </w:tc>
         <w:tc>
           <w:tcPr>
-            <w:tcW w:w="4425" w:type="dxa"/>
+            <w:tcW w:w="4545" w:type="dxa"/>
           </w:tcPr>
           <w:p>
             <w:pPr>
@@ -7420,7 +7418,7 @@
         </w:trPr>
         <w:tc>
           <w:tcPr>
-            <w:tcW w:w="3512" w:type="dxa"/>
+            <w:tcW w:w="3392" w:type="dxa"/>
           </w:tcPr>
           <w:p>
             <w:pPr>
@@ -7464,7 +7462,7 @@
         </w:tc>
         <w:tc>
           <w:tcPr>
-            <w:tcW w:w="4425" w:type="dxa"/>
+            <w:tcW w:w="4545" w:type="dxa"/>
           </w:tcPr>
           <w:p>
             <w:pPr>
@@ -7491,7 +7489,7 @@
         </w:trPr>
         <w:tc>
           <w:tcPr>
-            <w:tcW w:w="3512" w:type="dxa"/>
+            <w:tcW w:w="3392" w:type="dxa"/>
           </w:tcPr>
           <w:p>
             <w:pPr>
@@ -7535,7 +7533,7 @@
         </w:tc>
         <w:tc>
           <w:tcPr>
-            <w:tcW w:w="4425" w:type="dxa"/>
+            <w:tcW w:w="4545" w:type="dxa"/>
           </w:tcPr>
           <w:p>
             <w:pPr>
@@ -7562,7 +7560,7 @@
         </w:trPr>
         <w:tc>
           <w:tcPr>
-            <w:tcW w:w="3512" w:type="dxa"/>
+            <w:tcW w:w="3392" w:type="dxa"/>
           </w:tcPr>
           <w:p>
             <w:pPr>
@@ -7606,7 +7604,7 @@
         </w:tc>
         <w:tc>
           <w:tcPr>
-            <w:tcW w:w="4425" w:type="dxa"/>
+            <w:tcW w:w="4545" w:type="dxa"/>
           </w:tcPr>
           <w:p>
             <w:pPr>
@@ -7633,7 +7631,7 @@
         </w:trPr>
         <w:tc>
           <w:tcPr>
-            <w:tcW w:w="3512" w:type="dxa"/>
+            <w:tcW w:w="3392" w:type="dxa"/>
           </w:tcPr>
           <w:p>
             <w:pPr>
@@ -7677,7 +7675,7 @@
         </w:tc>
         <w:tc>
           <w:tcPr>
-            <w:tcW w:w="4425" w:type="dxa"/>
+            <w:tcW w:w="4545" w:type="dxa"/>
           </w:tcPr>
           <w:p>
             <w:pPr>
@@ -7704,7 +7702,7 @@
         </w:trPr>
         <w:tc>
           <w:tcPr>
-            <w:tcW w:w="3512" w:type="dxa"/>
+            <w:tcW w:w="3392" w:type="dxa"/>
           </w:tcPr>
           <w:p>
             <w:pPr>
@@ -7748,7 +7746,7 @@
         </w:tc>
         <w:tc>
           <w:tcPr>
-            <w:tcW w:w="4425" w:type="dxa"/>
+            <w:tcW w:w="4545" w:type="dxa"/>
           </w:tcPr>
           <w:p>
             <w:pPr>
@@ -7775,7 +7773,7 @@
         </w:trPr>
         <w:tc>
           <w:tcPr>
-            <w:tcW w:w="3512" w:type="dxa"/>
+            <w:tcW w:w="3392" w:type="dxa"/>
           </w:tcPr>
           <w:p>
             <w:pPr>
@@ -7819,7 +7817,7 @@
         </w:tc>
         <w:tc>
           <w:tcPr>
-            <w:tcW w:w="4425" w:type="dxa"/>
+            <w:tcW w:w="4545" w:type="dxa"/>
           </w:tcPr>
           <w:p>
             <w:pPr>
@@ -7841,128 +7839,284 @@
         </w:tc>
       </w:tr>
       <w:tr>
+        <w:trPr>
+          <w:cantSplit w:val="true"/>
+        </w:trPr>
         <w:tc>
           <w:tcPr>
-            <w:tcW w:type="dxa" w:w="3512"/>
+            <w:tcW w:w="3392" w:type="dxa"/>
           </w:tcPr>
           <w:p>
+            <w:pPr>
+              <w:spacing w:before="0" w:after="0" w:line="240" w:lineRule="auto"/>
+              <w:ind w:left="0" w:firstLine="0"/>
+              <w:suppressAutoHyphens/>
+            </w:pPr>
             <w:r>
+              <w:rPr>
+                <w:rFonts w:ascii="Calibri" w:hAnsi="Calibri"/>
+                <w:b w:val="0"/>
+                <w:i w:val="0"/>
+                <w:sz w:val="24"/>
+                <w:noProof/>
+              </w:rPr>
               <w:t>Attendance integrity - Claim</w:t>
             </w:r>
           </w:p>
         </w:tc>
         <w:tc>
           <w:tcPr>
-            <w:tcW w:type="dxa" w:w="1134"/>
+            <w:tcW w:w="1134" w:type="dxa"/>
           </w:tcPr>
           <w:p>
+            <w:pPr>
+              <w:spacing w:before="0" w:after="0" w:line="240" w:lineRule="auto"/>
+              <w:ind w:left="0" w:firstLine="0"/>
+              <w:suppressAutoHyphens/>
+            </w:pPr>
             <w:r>
+              <w:rPr>
+                <w:rFonts w:ascii="Calibri" w:hAnsi="Calibri"/>
+                <w:b w:val="0"/>
+                <w:i w:val="0"/>
+                <w:sz w:val="24"/>
+                <w:noProof/>
+              </w:rPr>
               <w:t>Functional</w:t>
             </w:r>
           </w:p>
         </w:tc>
         <w:tc>
           <w:tcPr>
-            <w:tcW w:type="dxa" w:w="4425"/>
+            <w:tcW w:w="4545" w:type="dxa"/>
           </w:tcPr>
           <w:p>
+            <w:pPr>
+              <w:spacing w:before="0" w:after="0" w:line="240" w:lineRule="auto"/>
+              <w:ind w:left="0" w:firstLine="0"/>
+              <w:suppressAutoHyphens/>
+            </w:pPr>
             <w:r>
+              <w:rPr>
+                <w:rFonts w:ascii="Calibri" w:hAnsi="Calibri"/>
+                <w:b w:val="0"/>
+                <w:i w:val="0"/>
+                <w:sz w:val="24"/>
+                <w:noProof/>
+              </w:rPr>
               <w:t>Confirmed-only attendance gate prevents erroneous billing artifacts</w:t>
             </w:r>
           </w:p>
         </w:tc>
       </w:tr>
       <w:tr>
+        <w:trPr>
+          <w:cantSplit w:val="true"/>
+        </w:trPr>
         <w:tc>
           <w:tcPr>
-            <w:tcW w:type="dxa" w:w="3512"/>
+            <w:tcW w:w="3392" w:type="dxa"/>
           </w:tcPr>
           <w:p>
+            <w:pPr>
+              <w:spacing w:before="0" w:after="0" w:line="240" w:lineRule="auto"/>
+              <w:ind w:left="0" w:firstLine="0"/>
+              <w:suppressAutoHyphens/>
+            </w:pPr>
             <w:r>
+              <w:rPr>
+                <w:rFonts w:ascii="Calibri" w:hAnsi="Calibri"/>
+                <w:b w:val="0"/>
+                <w:i w:val="0"/>
+                <w:sz w:val="24"/>
+                <w:noProof/>
+              </w:rPr>
               <w:t>Mandatory fields - Claim</w:t>
             </w:r>
           </w:p>
         </w:tc>
         <w:tc>
           <w:tcPr>
-            <w:tcW w:type="dxa" w:w="1134"/>
+            <w:tcW w:w="1134" w:type="dxa"/>
           </w:tcPr>
           <w:p>
+            <w:pPr>
+              <w:spacing w:before="0" w:after="0" w:line="240" w:lineRule="auto"/>
+              <w:ind w:left="0" w:firstLine="0"/>
+              <w:suppressAutoHyphens/>
+            </w:pPr>
             <w:r>
+              <w:rPr>
+                <w:rFonts w:ascii="Calibri" w:hAnsi="Calibri"/>
+                <w:b w:val="0"/>
+                <w:i w:val="0"/>
+                <w:sz w:val="24"/>
+                <w:noProof/>
+              </w:rPr>
               <w:t>Functional</w:t>
             </w:r>
           </w:p>
         </w:tc>
         <w:tc>
           <w:tcPr>
-            <w:tcW w:type="dxa" w:w="4425"/>
+            <w:tcW w:w="4545" w:type="dxa"/>
           </w:tcPr>
           <w:p>
+            <w:pPr>
+              <w:spacing w:before="0" w:after="0" w:line="240" w:lineRule="auto"/>
+              <w:ind w:left="0" w:firstLine="0"/>
+              <w:suppressAutoHyphens/>
+            </w:pPr>
             <w:r>
+              <w:rPr>
+                <w:rFonts w:ascii="Calibri" w:hAnsi="Calibri"/>
+                <w:b w:val="0"/>
+                <w:i w:val="0"/>
+                <w:sz w:val="24"/>
+                <w:noProof/>
+              </w:rPr>
               <w:t>Minimum required fields enforced on Claim creation</w:t>
             </w:r>
           </w:p>
         </w:tc>
       </w:tr>
       <w:tr>
+        <w:trPr>
+          <w:cantSplit w:val="true"/>
+        </w:trPr>
         <w:tc>
           <w:tcPr>
-            <w:tcW w:type="dxa" w:w="3512"/>
+            <w:tcW w:w="3392" w:type="dxa"/>
           </w:tcPr>
           <w:p>
+            <w:pPr>
+              <w:spacing w:before="0" w:after="0" w:line="240" w:lineRule="auto"/>
+              <w:ind w:left="0" w:firstLine="0"/>
+              <w:suppressAutoHyphens/>
+            </w:pPr>
             <w:r>
+              <w:rPr>
+                <w:rFonts w:ascii="Calibri" w:hAnsi="Calibri"/>
+                <w:b w:val="0"/>
+                <w:i w:val="0"/>
+                <w:sz w:val="24"/>
+                <w:noProof/>
+              </w:rPr>
               <w:t>Billing units server-calculated - Claim</w:t>
             </w:r>
           </w:p>
         </w:tc>
         <w:tc>
           <w:tcPr>
-            <w:tcW w:type="dxa" w:w="1134"/>
+            <w:tcW w:w="1134" w:type="dxa"/>
           </w:tcPr>
           <w:p>
+            <w:pPr>
+              <w:spacing w:before="0" w:after="0" w:line="240" w:lineRule="auto"/>
+              <w:ind w:left="0" w:firstLine="0"/>
+              <w:suppressAutoHyphens/>
+            </w:pPr>
             <w:r>
+              <w:rPr>
+                <w:rFonts w:ascii="Calibri" w:hAnsi="Calibri"/>
+                <w:b w:val="0"/>
+                <w:i w:val="0"/>
+                <w:sz w:val="24"/>
+                <w:noProof/>
+              </w:rPr>
               <w:t>Functional</w:t>
             </w:r>
           </w:p>
         </w:tc>
         <w:tc>
           <w:tcPr>
-            <w:tcW w:type="dxa" w:w="4425"/>
+            <w:tcW w:w="4545" w:type="dxa"/>
           </w:tcPr>
           <w:p>
+            <w:pPr>
+              <w:spacing w:before="0" w:after="0" w:line="240" w:lineRule="auto"/>
+              <w:ind w:left="0" w:firstLine="0"/>
+              <w:suppressAutoHyphens/>
+            </w:pPr>
             <w:r>
+              <w:rPr>
+                <w:rFonts w:ascii="Calibri" w:hAnsi="Calibri"/>
+                <w:b w:val="0"/>
+                <w:i w:val="0"/>
+                <w:sz w:val="24"/>
+                <w:noProof/>
+              </w:rPr>
               <w:t>Server-calculated units_billed prevents billing manipulation</w:t>
             </w:r>
           </w:p>
         </w:tc>
       </w:tr>
       <w:tr>
+        <w:trPr>
+          <w:cantSplit w:val="true"/>
+        </w:trPr>
         <w:tc>
           <w:tcPr>
-            <w:tcW w:type="dxa" w:w="3512"/>
+            <w:tcW w:w="3392" w:type="dxa"/>
           </w:tcPr>
           <w:p>
+            <w:pPr>
+              <w:spacing w:before="0" w:after="0" w:line="240" w:lineRule="auto"/>
+              <w:ind w:left="0" w:firstLine="0"/>
+              <w:suppressAutoHyphens/>
+            </w:pPr>
             <w:r>
+              <w:rPr>
+                <w:rFonts w:ascii="Calibri" w:hAnsi="Calibri"/>
+                <w:b w:val="0"/>
+                <w:i w:val="0"/>
+                <w:sz w:val="24"/>
+                <w:noProof/>
+              </w:rPr>
               <w:t>Not found handling - Claim</w:t>
             </w:r>
           </w:p>
         </w:tc>
         <w:tc>
           <w:tcPr>
-            <w:tcW w:type="dxa" w:w="1134"/>
+            <w:tcW w:w="1134" w:type="dxa"/>
           </w:tcPr>
           <w:p>
+            <w:pPr>
+              <w:spacing w:before="0" w:after="0" w:line="240" w:lineRule="auto"/>
+              <w:ind w:left="0" w:firstLine="0"/>
+              <w:suppressAutoHyphens/>
+            </w:pPr>
             <w:r>
+              <w:rPr>
+                <w:rFonts w:ascii="Calibri" w:hAnsi="Calibri"/>
+                <w:b w:val="0"/>
+                <w:i w:val="0"/>
+                <w:sz w:val="24"/>
+                <w:noProof/>
+              </w:rPr>
               <w:t>Functional</w:t>
             </w:r>
           </w:p>
         </w:tc>
         <w:tc>
           <w:tcPr>
-            <w:tcW w:type="dxa" w:w="4425"/>
+            <w:tcW w:w="4545" w:type="dxa"/>
           </w:tcPr>
           <w:p>
+            <w:pPr>
+              <w:spacing w:before="0" w:after="0" w:line="240" w:lineRule="auto"/>
+              <w:ind w:left="0" w:firstLine="0"/>
+              <w:suppressAutoHyphens/>
+            </w:pPr>
             <w:r>
+              <w:rPr>
+                <w:rFonts w:ascii="Calibri" w:hAnsi="Calibri"/>
+                <w:b w:val="0"/>
+                <w:i w:val="0"/>
+                <w:sz w:val="24"/>
+                <w:noProof/>
+              </w:rPr>
               <w:t>Non-existent resource returns 404 with structured error body</w:t>
             </w:r>
           </w:p>
@@ -10958,7 +11112,7 @@
           <w:sz w:val="24"/>
           <w:noProof/>
         </w:rPr>
-        <w:t xml:space="preserve">def test_tc_4_10_phase2_fields_rejected_with_400</w:t>
+        <w:t>def test_tc_4_10_phase2_fields_rejected_with_400</w:t>
       </w:r>
     </w:p>
     <w:p>
@@ -10975,7 +11129,7 @@
           <w:sz w:val="24"/>
           <w:noProof/>
         </w:rPr>
-        <w:t xml:space="preserve">def test_tc_4_11_optimistic_locking_version_conflict_returns_409</w:t>
+        <w:t>def test_tc_4_11_optimistic_locking_version_conflict_returns_409</w:t>
       </w:r>
     </w:p>
     <w:p>
@@ -10992,7 +11146,7 @@
           <w:sz w:val="24"/>
           <w:noProof/>
         </w:rPr>
-        <w:t xml:space="preserve">def test_tc_4_12_cross_tenant_attendance_reference_rejected</w:t>
+        <w:t>def test_tc_4_12_cross_tenant_attendance_reference_rejected</w:t>
       </w:r>
     </w:p>
     <w:p>
@@ -11009,7 +11163,7 @@
           <w:sz w:val="24"/>
           <w:noProof/>
         </w:rPr>
-        <w:t xml:space="preserve">def test_tc_4_13_already_billed_attendance_cannot_be_reclaimed</w:t>
+        <w:t>def test_tc_4_13_already_billed_attendance_cannot_be_reclaimed</w:t>
       </w:r>
     </w:p>
     <w:p>
@@ -11026,7 +11180,7 @@
           <w:sz w:val="24"/>
           <w:noProof/>
         </w:rPr>
-        <w:t xml:space="preserve">def test_tc_4_14_get_nonexistent_claim_returns_404</w:t>
+        <w:t>def test_tc_4_14_get_nonexistent_claim_returns_404</w:t>
       </w:r>
     </w:p>
     <w:p>
@@ -11043,7 +11197,7 @@
           <w:sz w:val="24"/>
           <w:noProof/>
         </w:rPr>
-        <w:t xml:space="preserve">def test_tc_4_15_paid_claim_fully_immutable</w:t>
+        <w:t>def test_tc_4_15_paid_claim_fully_immutable</w:t>
       </w:r>
     </w:p>
     <w:p>
@@ -11070,7 +11224,7 @@
           <w:sz w:val="24"/>
           <w:noProof/>
         </w:rPr>
-        <w:t xml:space="preserve"> - 10 functions (REQ_IDs 5.1 - 5.10)</w:t>
+        <w:t xml:space="preserve"> - 21 functions (TC-5.1 - TC-5.21)</w:t>
       </w:r>
     </w:p>
     <w:p>
@@ -11087,7 +11241,7 @@
           <w:sz w:val="24"/>
           <w:noProof/>
         </w:rPr>
-        <w:t>def test_5_1_unique_mar_per_participant_medication_and_scheduled_time</w:t>
+        <w:t>def test_tc_5_1_duplicate_mar_event_returns_409</w:t>
       </w:r>
     </w:p>
     <w:p>
@@ -11104,7 +11258,7 @@
           <w:sz w:val="24"/>
           <w:noProof/>
         </w:rPr>
-        <w:t>def test_5_2_rbac_write_restricted_to_nurse_medication_aide</w:t>
+        <w:t>def test_tc_5_2_successful_mar_creation_audit_trail</w:t>
       </w:r>
     </w:p>
     <w:p>
@@ -11121,7 +11275,7 @@
           <w:sz w:val="24"/>
           <w:noProof/>
         </w:rPr>
-        <w:t>def test_5_3_42cfr_part2_controlled_substance_access_gate</w:t>
+        <w:t>def test_tc_5_3_billing_specialist_cannot_create_mar</w:t>
       </w:r>
     </w:p>
     <w:p>
@@ -11138,7 +11292,7 @@
           <w:sz w:val="24"/>
           <w:noProof/>
         </w:rPr>
-        <w:t>def test_5_4_audit_log_on_controlled_substance_read_and_write</w:t>
+        <w:t>def test_tc_5_4_controlled_substance_read_denied_for_non_privileged_role</w:t>
       </w:r>
     </w:p>
     <w:p>
@@ -11155,7 +11309,7 @@
           <w:sz w:val="24"/>
           <w:noProof/>
         </w:rPr>
-        <w:t>def test_5_5_status_field_rules_administered_refused_held_missed</w:t>
+        <w:t>def test_tc_5_5_administered_status_requires_administered_time</w:t>
       </w:r>
     </w:p>
     <w:p>
@@ -11172,7 +11326,7 @@
           <w:sz w:val="24"/>
           <w:noProof/>
         </w:rPr>
-        <w:t>def test_5_6_administered_time_required_and_within_bounds</w:t>
+        <w:t>def test_tc_5_6_controlled_substance_read_allowed_for_privileged_role</w:t>
       </w:r>
     </w:p>
     <w:p>
@@ -11189,7 +11343,7 @@
           <w:sz w:val="24"/>
           <w:noProof/>
         </w:rPr>
-        <w:t>def test_5_7_route_must_be_oral_injection_or_topical</w:t>
+        <w:t>def test_tc_5_7_refused_status_requires_notes</w:t>
       </w:r>
     </w:p>
     <w:p>
@@ -11206,7 +11360,7 @@
           <w:sz w:val="24"/>
           <w:noProof/>
         </w:rPr>
-        <w:t>def test_5_8_administered_record_is_immutable</w:t>
+        <w:t>def test_tc_5_8_held_status_requires_notes</w:t>
       </w:r>
     </w:p>
     <w:p>
@@ -11223,7 +11377,7 @@
           <w:sz w:val="24"/>
           <w:noProof/>
         </w:rPr>
-        <w:t>def test_5_9_correction_record_references_original_mar_id</w:t>
+        <w:t>def test_tc_5_9_future_administered_time_rejected</w:t>
       </w:r>
     </w:p>
     <w:p>
@@ -11240,7 +11394,7 @@
           <w:sz w:val="24"/>
           <w:noProof/>
         </w:rPr>
-        <w:t>def test_5_10_optimistic_locking_version_conflict_returns_409</w:t>
+        <w:t>def test_tc_5_10_administered_time_too_early_rejected</w:t>
       </w:r>
     </w:p>
     <w:p>
@@ -11252,22 +11406,12 @@
       <w:r>
         <w:rPr>
           <w:rFonts w:ascii="Calibri" w:hAnsi="Calibri"/>
-          <w:b/>
+          <w:b w:val="0"/>
           <w:i w:val="0"/>
           <w:sz w:val="24"/>
           <w:noProof/>
         </w:rPr>
-        <w:t>test_incident.py</w:t>
-      </w:r>
-      <w:r>
-        <w:rPr>
-          <w:rFonts w:ascii="Calibri" w:hAnsi="Calibri"/>
-          <w:b w:val="0"/>
-          <w:i w:val="0"/>
-          <w:sz w:val="24"/>
-          <w:noProof/>
-        </w:rPr>
-        <w:t xml:space="preserve"> - 8 functions (REQ_IDs 6.1 - 6.8)</w:t>
+        <w:t>def test_tc_5_11_administered_by_must_be_nurse_role</w:t>
       </w:r>
     </w:p>
     <w:p>
@@ -11284,7 +11428,7 @@
           <w:sz w:val="24"/>
           <w:noProof/>
         </w:rPr>
-        <w:t>def test_6_1_incident_id_is_sole_unique_constraint_no_composite_key</w:t>
+        <w:t>def test_tc_5_12_administered_by_user_not_found_rejected</w:t>
       </w:r>
     </w:p>
     <w:p>
@@ -11301,7 +11445,7 @@
           <w:sz w:val="24"/>
           <w:noProof/>
         </w:rPr>
-        <w:t>def test_6_2_rbac_staff_can_create_external_roles_denied</w:t>
+        <w:t>def test_tc_5_13_coordinator_cannot_create_mar</w:t>
       </w:r>
     </w:p>
     <w:p>
@@ -11318,7 +11462,7 @@
           <w:sz w:val="24"/>
           <w:noProof/>
         </w:rPr>
-        <w:t>def test_6_3_42cfr_part2_sud_related_incident_access_gate</w:t>
+        <w:t>def test_tc_5_14_administered_mar_is_immutable</w:t>
       </w:r>
     </w:p>
     <w:p>
@@ -11335,7 +11479,7 @@
           <w:sz w:val="24"/>
           <w:noProof/>
         </w:rPr>
-        <w:t>def test_6_4_audit_log_on_sud_related_incident_read_and_write</w:t>
+        <w:t>def test_tc_5_15_administered_mar_immutable_check_fires_before_version_check</w:t>
       </w:r>
     </w:p>
     <w:p>
@@ -11352,7 +11496,7 @@
           <w:sz w:val="24"/>
           <w:noProof/>
         </w:rPr>
-        <w:t>def test_6_5_state_machine_auto_escalates_severe_and_medical_emergency</w:t>
+        <w:t>def test_tc_5_16_patch_notes_on_missed_mar_succeeds</w:t>
       </w:r>
     </w:p>
     <w:p>
@@ -11369,7 +11513,7 @@
           <w:sz w:val="24"/>
           <w:noProof/>
         </w:rPr>
-        <w:t>def test_6_6_alert_raised_when_escalated_incident_approaches_24_hour_deadline</w:t>
+        <w:t>def test_tc_5_17_correction_mar_requires_original_mar_id</w:t>
       </w:r>
     </w:p>
     <w:p>
@@ -11386,7 +11530,7 @@
           <w:sz w:val="24"/>
           <w:noProof/>
         </w:rPr>
-        <w:t>def test_6_7_closed_incident_is_immutable</w:t>
+        <w:t>def test_tc_5_18_correction_mar_requires_notes_min_20_chars</w:t>
       </w:r>
     </w:p>
     <w:p>
@@ -11403,7 +11547,323 @@
           <w:sz w:val="24"/>
           <w:noProof/>
         </w:rPr>
-        <w:t>def test_6_8_optimistic_locking_version_conflict_returns_409</w:t>
+        <w:t>def test_tc_5_19_correction_mar_with_valid_fields_succeeds</w:t>
+      </w:r>
+    </w:p>
+    <w:p>
+      <w:pPr>
+        <w:spacing w:before="0" w:after="0" w:line="240" w:lineRule="auto"/>
+        <w:ind w:left="0" w:firstLine="0"/>
+        <w:suppressAutoHyphens/>
+      </w:pPr>
+      <w:r>
+        <w:rPr>
+          <w:rFonts w:ascii="Calibri" w:hAnsi="Calibri"/>
+          <w:b w:val="0"/>
+          <w:i w:val="0"/>
+          <w:sz w:val="24"/>
+          <w:noProof/>
+        </w:rPr>
+        <w:t>def test_tc_5_20_patch_missed_mar_status_transition_succeeds</w:t>
+      </w:r>
+    </w:p>
+    <w:p>
+      <w:pPr>
+        <w:spacing w:before="0" w:after="0" w:line="240" w:lineRule="auto"/>
+        <w:ind w:left="0" w:firstLine="0"/>
+        <w:suppressAutoHyphens/>
+      </w:pPr>
+      <w:r>
+        <w:rPr>
+          <w:rFonts w:ascii="Calibri" w:hAnsi="Calibri"/>
+          <w:b w:val="0"/>
+          <w:i w:val="0"/>
+          <w:sz w:val="24"/>
+          <w:noProof/>
+        </w:rPr>
+        <w:t>def test_tc_5_21_stale_version_on_missed_mar_returns_version_conflict</w:t>
+      </w:r>
+    </w:p>
+    <w:p>
+      <w:pPr>
+        <w:spacing w:before="0" w:after="0" w:line="240" w:lineRule="auto"/>
+        <w:ind w:left="0" w:firstLine="0"/>
+        <w:suppressAutoHyphens/>
+      </w:pPr>
+      <w:r>
+        <w:rPr>
+          <w:rFonts w:ascii="Calibri" w:hAnsi="Calibri"/>
+          <w:b/>
+          <w:i w:val="0"/>
+          <w:sz w:val="24"/>
+          <w:noProof/>
+        </w:rPr>
+        <w:t>test_incident.py</w:t>
+      </w:r>
+      <w:r>
+        <w:rPr>
+          <w:rFonts w:ascii="Calibri" w:hAnsi="Calibri"/>
+          <w:b w:val="0"/>
+          <w:i w:val="0"/>
+          <w:sz w:val="24"/>
+          <w:noProof/>
+        </w:rPr>
+        <w:t xml:space="preserve"> - 15 functions (TC-6.1 - TC-6.15)</w:t>
+      </w:r>
+    </w:p>
+    <w:p>
+      <w:pPr>
+        <w:spacing w:before="0" w:after="0" w:line="240" w:lineRule="auto"/>
+        <w:ind w:left="0" w:firstLine="0"/>
+        <w:suppressAutoHyphens/>
+      </w:pPr>
+      <w:r>
+        <w:rPr>
+          <w:rFonts w:ascii="Calibri" w:hAnsi="Calibri"/>
+          <w:b w:val="0"/>
+          <w:i w:val="0"/>
+          <w:sz w:val="24"/>
+          <w:noProof/>
+        </w:rPr>
+        <w:t>def test_tc_6_1_successful_incident_creation_audit_trail</w:t>
+      </w:r>
+    </w:p>
+    <w:p>
+      <w:pPr>
+        <w:spacing w:before="0" w:after="0" w:line="240" w:lineRule="auto"/>
+        <w:ind w:left="0" w:firstLine="0"/>
+        <w:suppressAutoHyphens/>
+      </w:pPr>
+      <w:r>
+        <w:rPr>
+          <w:rFonts w:ascii="Calibri" w:hAnsi="Calibri"/>
+          <w:b w:val="0"/>
+          <w:i w:val="0"/>
+          <w:sz w:val="24"/>
+          <w:noProof/>
+        </w:rPr>
+        <w:t>def test_tc_6_2_admin_and_coordinator_can_create_incident</w:t>
+      </w:r>
+    </w:p>
+    <w:p>
+      <w:pPr>
+        <w:spacing w:before="0" w:after="0" w:line="240" w:lineRule="auto"/>
+        <w:ind w:left="0" w:firstLine="0"/>
+        <w:suppressAutoHyphens/>
+      </w:pPr>
+      <w:r>
+        <w:rPr>
+          <w:rFonts w:ascii="Calibri" w:hAnsi="Calibri"/>
+          <w:b w:val="0"/>
+          <w:i w:val="0"/>
+          <w:sz w:val="24"/>
+          <w:noProof/>
+        </w:rPr>
+        <w:t>def test_tc_6_3_physician_cannot_create_incident</w:t>
+      </w:r>
+    </w:p>
+    <w:p>
+      <w:pPr>
+        <w:spacing w:before="0" w:after="0" w:line="240" w:lineRule="auto"/>
+        <w:ind w:left="0" w:firstLine="0"/>
+        <w:suppressAutoHyphens/>
+      </w:pPr>
+      <w:r>
+        <w:rPr>
+          <w:rFonts w:ascii="Calibri" w:hAnsi="Calibri"/>
+          <w:b w:val="0"/>
+          <w:i w:val="0"/>
+          <w:sz w:val="24"/>
+          <w:noProof/>
+        </w:rPr>
+        <w:t>def test_tc_6_4_physician_cannot_read_any_incident</w:t>
+      </w:r>
+    </w:p>
+    <w:p>
+      <w:pPr>
+        <w:spacing w:before="0" w:after="0" w:line="240" w:lineRule="auto"/>
+        <w:ind w:left="0" w:firstLine="0"/>
+        <w:suppressAutoHyphens/>
+      </w:pPr>
+      <w:r>
+        <w:rPr>
+          <w:rFonts w:ascii="Calibri" w:hAnsi="Calibri"/>
+          <w:b w:val="0"/>
+          <w:i w:val="0"/>
+          <w:sz w:val="24"/>
+          <w:noProof/>
+        </w:rPr>
+        <w:t>def test_tc_6_5_billing_specialist_read_sud_incident_denied_with_audit</w:t>
+      </w:r>
+    </w:p>
+    <w:p>
+      <w:pPr>
+        <w:spacing w:before="0" w:after="0" w:line="240" w:lineRule="auto"/>
+        <w:ind w:left="0" w:firstLine="0"/>
+        <w:suppressAutoHyphens/>
+      </w:pPr>
+      <w:r>
+        <w:rPr>
+          <w:rFonts w:ascii="Calibri" w:hAnsi="Calibri"/>
+          <w:b w:val="0"/>
+          <w:i w:val="0"/>
+          <w:sz w:val="24"/>
+          <w:noProof/>
+        </w:rPr>
+        <w:t>def test_tc_6_6_medical_emergency_incident_auto_escalates</w:t>
+      </w:r>
+    </w:p>
+    <w:p>
+      <w:pPr>
+        <w:spacing w:before="0" w:after="0" w:line="240" w:lineRule="auto"/>
+        <w:ind w:left="0" w:firstLine="0"/>
+        <w:suppressAutoHyphens/>
+      </w:pPr>
+      <w:r>
+        <w:rPr>
+          <w:rFonts w:ascii="Calibri" w:hAnsi="Calibri"/>
+          <w:b w:val="0"/>
+          <w:i w:val="0"/>
+          <w:sz w:val="24"/>
+          <w:noProof/>
+        </w:rPr>
+        <w:t>def test_tc_6_7_coordinator_can_read_sud_incident</w:t>
+      </w:r>
+    </w:p>
+    <w:p>
+      <w:pPr>
+        <w:spacing w:before="0" w:after="0" w:line="240" w:lineRule="auto"/>
+        <w:ind w:left="0" w:firstLine="0"/>
+        <w:suppressAutoHyphens/>
+      </w:pPr>
+      <w:r>
+        <w:rPr>
+          <w:rFonts w:ascii="Calibri" w:hAnsi="Calibri"/>
+          <w:b w:val="0"/>
+          <w:i w:val="0"/>
+          <w:sz w:val="24"/>
+          <w:noProof/>
+        </w:rPr>
+        <w:t>def test_tc_6_8_closed_incident_is_immutable</w:t>
+      </w:r>
+    </w:p>
+    <w:p>
+      <w:pPr>
+        <w:spacing w:before="0" w:after="0" w:line="240" w:lineRule="auto"/>
+        <w:ind w:left="0" w:firstLine="0"/>
+        <w:suppressAutoHyphens/>
+      </w:pPr>
+      <w:r>
+        <w:rPr>
+          <w:rFonts w:ascii="Calibri" w:hAnsi="Calibri"/>
+          <w:b w:val="0"/>
+          <w:i w:val="0"/>
+          <w:sz w:val="24"/>
+          <w:noProof/>
+        </w:rPr>
+        <w:t>def test_tc_6_9_severe_incident_auto_escalates</w:t>
+      </w:r>
+    </w:p>
+    <w:p>
+      <w:pPr>
+        <w:spacing w:before="0" w:after="0" w:line="240" w:lineRule="auto"/>
+        <w:ind w:left="0" w:firstLine="0"/>
+        <w:suppressAutoHyphens/>
+      </w:pPr>
+      <w:r>
+        <w:rPr>
+          <w:rFonts w:ascii="Calibri" w:hAnsi="Calibri"/>
+          <w:b w:val="0"/>
+          <w:i w:val="0"/>
+          <w:sz w:val="24"/>
+          <w:noProof/>
+        </w:rPr>
+        <w:t>def test_tc_6_10_escalation_alert_job_emits_escalation_alert_audit</w:t>
+      </w:r>
+    </w:p>
+    <w:p>
+      <w:pPr>
+        <w:spacing w:before="0" w:after="0" w:line="240" w:lineRule="auto"/>
+        <w:ind w:left="0" w:firstLine="0"/>
+        <w:suppressAutoHyphens/>
+      </w:pPr>
+      <w:r>
+        <w:rPr>
+          <w:rFonts w:ascii="Calibri" w:hAnsi="Calibri"/>
+          <w:b w:val="0"/>
+          <w:i w:val="0"/>
+          <w:sz w:val="24"/>
+          <w:noProof/>
+        </w:rPr>
+        <w:t>def test_tc_6_11_addendum_incident_links_to_original_incident</w:t>
+      </w:r>
+    </w:p>
+    <w:p>
+      <w:pPr>
+        <w:spacing w:before="0" w:after="0" w:line="240" w:lineRule="auto"/>
+        <w:ind w:left="0" w:firstLine="0"/>
+        <w:suppressAutoHyphens/>
+      </w:pPr>
+      <w:r>
+        <w:rPr>
+          <w:rFonts w:ascii="Calibri" w:hAnsi="Calibri"/>
+          <w:b w:val="0"/>
+          <w:i w:val="0"/>
+          <w:sz w:val="24"/>
+          <w:noProof/>
+        </w:rPr>
+        <w:t>def test_tc_6_12_closed_incident_immutable_check_fires_before_version_check</w:t>
+      </w:r>
+    </w:p>
+    <w:p>
+      <w:pPr>
+        <w:spacing w:before="0" w:after="0" w:line="240" w:lineRule="auto"/>
+        <w:ind w:left="0" w:firstLine="0"/>
+        <w:suppressAutoHyphens/>
+      </w:pPr>
+      <w:r>
+        <w:rPr>
+          <w:rFonts w:ascii="Calibri" w:hAnsi="Calibri"/>
+          <w:b w:val="0"/>
+          <w:i w:val="0"/>
+          <w:sz w:val="24"/>
+          <w:noProof/>
+        </w:rPr>
+        <w:t>def test_tc_6_13_escalated_to_closed_requires_regulatory_submission_date</w:t>
+      </w:r>
+    </w:p>
+    <w:p>
+      <w:pPr>
+        <w:spacing w:before="0" w:after="0" w:line="240" w:lineRule="auto"/>
+        <w:ind w:left="0" w:firstLine="0"/>
+        <w:suppressAutoHyphens/>
+      </w:pPr>
+      <w:r>
+        <w:rPr>
+          <w:rFonts w:ascii="Calibri" w:hAnsi="Calibri"/>
+          <w:b w:val="0"/>
+          <w:i w:val="0"/>
+          <w:sz w:val="24"/>
+          <w:noProof/>
+        </w:rPr>
+        <w:t>def test_tc_6_14_stale_version_on_incident_returns_version_conflict</w:t>
+      </w:r>
+    </w:p>
+    <w:p>
+      <w:pPr>
+        <w:spacing w:before="0" w:after="0" w:line="240" w:lineRule="auto"/>
+        <w:ind w:left="0" w:firstLine="0"/>
+        <w:suppressAutoHyphens/>
+      </w:pPr>
+      <w:r>
+        <w:rPr>
+          <w:rFonts w:ascii="Calibri" w:hAnsi="Calibri"/>
+          <w:b w:val="0"/>
+          <w:i w:val="0"/>
+          <w:sz w:val="24"/>
+          <w:noProof/>
+        </w:rPr>
+        <w:t>def test_tc_6_15_closed_incident_patch_any_field_returns_immutable</w:t>
       </w:r>
     </w:p>
     <w:p>

</xml_diff>

<commit_message>
update docs: test strategy, test plan, helpers, README - groups 7-9, TC-2.14/2.15, hardcoded dates removed
Co-Authored-By: Claude Sonnet 4.6 <noreply@anthropic.com>
</commit_message>
<xml_diff>
--- a/test_strategy_phase1.docx
+++ b/test_strategy_phase1.docx
@@ -188,6 +188,8 @@
           <w:insideH w:val="none" w:sz="0" w:space="0" w:color="auto"/>
           <w:insideV w:val="none" w:sz="0" w:space="0" w:color="auto"/>
         </w:tblBorders>
+        <w:tblW w:w="9071" w:type="dxa"/>
+        <w:tblLayout w:type="fixed"/>
       </w:tblPr>
       <w:tblGrid>
         <w:gridCol w:w="1247"/>
@@ -1272,6 +1274,8 @@
           <w:insideH w:val="none" w:sz="0" w:space="0" w:color="auto"/>
           <w:insideV w:val="none" w:sz="0" w:space="0" w:color="auto"/>
         </w:tblBorders>
+        <w:tblW w:w="9071" w:type="dxa"/>
+        <w:tblLayout w:type="fixed"/>
       </w:tblPr>
       <w:tblGrid>
         <w:gridCol w:w="454"/>
@@ -1979,6 +1983,8 @@
           <w:insideH w:val="none" w:sz="0" w:space="0" w:color="auto"/>
           <w:insideV w:val="none" w:sz="0" w:space="0" w:color="auto"/>
         </w:tblBorders>
+        <w:tblW w:w="9071" w:type="dxa"/>
+        <w:tblLayout w:type="fixed"/>
       </w:tblPr>
       <w:tblGrid>
         <w:gridCol w:w="454"/>
@@ -3036,6 +3042,8 @@
           <w:insideH w:val="none" w:sz="0" w:space="0" w:color="auto"/>
           <w:insideV w:val="none" w:sz="0" w:space="0" w:color="auto"/>
         </w:tblBorders>
+        <w:tblW w:w="9070" w:type="dxa"/>
+        <w:tblLayout w:type="fixed"/>
       </w:tblPr>
       <w:tblGrid>
         <w:gridCol w:w="907"/>
@@ -4232,6 +4240,8 @@
           <w:insideH w:val="none" w:sz="0" w:space="0" w:color="auto"/>
           <w:insideV w:val="none" w:sz="0" w:space="0" w:color="auto"/>
         </w:tblBorders>
+        <w:tblW w:w="9071" w:type="dxa"/>
+        <w:tblLayout w:type="fixed"/>
       </w:tblPr>
       <w:tblGrid>
         <w:gridCol w:w="1247"/>
@@ -4565,6 +4575,8 @@
           <w:insideH w:val="none" w:sz="0" w:space="0" w:color="auto"/>
           <w:insideV w:val="none" w:sz="0" w:space="0" w:color="auto"/>
         </w:tblBorders>
+        <w:tblW w:w="9071" w:type="dxa"/>
+        <w:tblLayout w:type="fixed"/>
       </w:tblPr>
       <w:tblGrid>
         <w:gridCol w:w="4309"/>
@@ -5972,6 +5984,8 @@
           <w:insideH w:val="none" w:sz="0" w:space="0" w:color="auto"/>
           <w:insideV w:val="none" w:sz="0" w:space="0" w:color="auto"/>
         </w:tblBorders>
+        <w:tblW w:w="9071" w:type="dxa"/>
+        <w:tblLayout w:type="fixed"/>
       </w:tblPr>
       <w:tblGrid>
         <w:gridCol w:w="907"/>
@@ -6497,6 +6511,8 @@
           <w:insideH w:val="none" w:sz="0" w:space="0" w:color="auto"/>
           <w:insideV w:val="none" w:sz="0" w:space="0" w:color="auto"/>
         </w:tblBorders>
+        <w:tblW w:w="9070" w:type="dxa"/>
+        <w:tblLayout w:type="fixed"/>
       </w:tblPr>
       <w:tblGrid>
         <w:gridCol w:w="1722"/>
@@ -7193,6 +7209,8 @@
           <w:insideH w:val="none" w:sz="0" w:space="0" w:color="auto"/>
           <w:insideV w:val="none" w:sz="0" w:space="0" w:color="auto"/>
         </w:tblBorders>
+        <w:tblW w:w="9071" w:type="dxa"/>
+        <w:tblLayout w:type="fixed"/>
       </w:tblPr>
       <w:tblGrid>
         <w:gridCol w:w="3392"/>
@@ -8171,6 +8189,8 @@
           <w:insideH w:val="none" w:sz="0" w:space="0" w:color="auto"/>
           <w:insideV w:val="none" w:sz="0" w:space="0" w:color="auto"/>
         </w:tblBorders>
+        <w:tblW w:w="9071" w:type="dxa"/>
+        <w:tblLayout w:type="fixed"/>
       </w:tblPr>
       <w:tblGrid>
         <w:gridCol w:w="6348"/>
@@ -8688,6 +8708,8 @@
           <w:insideH w:val="none" w:sz="0" w:space="0" w:color="auto"/>
           <w:insideV w:val="none" w:sz="0" w:space="0" w:color="auto"/>
         </w:tblBorders>
+        <w:tblW w:w="9070" w:type="dxa"/>
+        <w:tblLayout w:type="fixed"/>
       </w:tblPr>
       <w:tblGrid>
         <w:gridCol w:w="1833"/>
@@ -10463,7 +10485,7 @@
           <w:sz w:val="24"/>
           <w:noProof/>
         </w:rPr>
-        <w:t xml:space="preserve"> - 13 functions (TC-2.1 - TC-2.13)</w:t>
+        <w:t xml:space="preserve"> - 15 functions (TC-2.1 - TC-2.15)</w:t>
       </w:r>
     </w:p>
     <w:p>
@@ -10696,22 +10718,12 @@
       <w:r>
         <w:rPr>
           <w:rFonts w:ascii="Calibri" w:hAnsi="Calibri"/>
-          <w:b/>
-          <w:i w:val="0"/>
-          <w:sz w:val="24"/>
-          <w:noProof/>
-        </w:rPr>
-        <w:t>test_attendance.py</w:t>
-      </w:r>
-      <w:r>
-        <w:rPr>
-          <w:rFonts w:ascii="Calibri" w:hAnsi="Calibri"/>
           <w:b w:val="0"/>
           <w:i w:val="0"/>
           <w:sz w:val="24"/>
           <w:noProof/>
         </w:rPr>
-        <w:t xml:space="preserve"> - 12 functions (TC-3.1 - TC-3.12)</w:t>
+        <w:t>def test_tc_2_14_inactive_user_denied_before_role_evaluation</w:t>
       </w:r>
     </w:p>
     <w:p>
@@ -10728,7 +10740,7 @@
           <w:sz w:val="24"/>
           <w:noProof/>
         </w:rPr>
-        <w:t>def test_tc_3_1_positive_attendance_creation_by_program_administrator</w:t>
+        <w:t>def test_tc_2_15_suspended_user_denied_before_role_evaluation</w:t>
       </w:r>
     </w:p>
     <w:p>
@@ -10740,12 +10752,22 @@
       <w:r>
         <w:rPr>
           <w:rFonts w:ascii="Calibri" w:hAnsi="Calibri"/>
+          <w:b/>
+          <w:i w:val="0"/>
+          <w:sz w:val="24"/>
+          <w:noProof/>
+        </w:rPr>
+        <w:t>test_attendance.py</w:t>
+      </w:r>
+      <w:r>
+        <w:rPr>
+          <w:rFonts w:ascii="Calibri" w:hAnsi="Calibri"/>
           <w:b w:val="0"/>
           <w:i w:val="0"/>
           <w:sz w:val="24"/>
           <w:noProof/>
         </w:rPr>
-        <w:t>def test_tc_3_2_positive_attendance_creation_by_care_coordinator</w:t>
+        <w:t xml:space="preserve"> - 12 functions (TC-3.1 - TC-3.12)</w:t>
       </w:r>
     </w:p>
     <w:p>
@@ -10762,7 +10784,7 @@
           <w:sz w:val="24"/>
           <w:noProof/>
         </w:rPr>
-        <w:t>def test_tc_3_3_missing_date_of_service_returns_400</w:t>
+        <w:t>def test_tc_3_1_positive_attendance_creation_by_program_administrator</w:t>
       </w:r>
     </w:p>
     <w:p>
@@ -10779,7 +10801,7 @@
           <w:sz w:val="24"/>
           <w:noProof/>
         </w:rPr>
-        <w:t>def test_tc_3_4_missing_participant_id_returns_400</w:t>
+        <w:t>def test_tc_3_2_positive_attendance_creation_by_care_coordinator</w:t>
       </w:r>
     </w:p>
     <w:p>
@@ -10796,7 +10818,7 @@
           <w:sz w:val="24"/>
           <w:noProof/>
         </w:rPr>
-        <w:t>def test_tc_3_5_duplicate_participant_date_returns_409</w:t>
+        <w:t>def test_tc_3_3_missing_date_of_service_returns_400</w:t>
       </w:r>
     </w:p>
     <w:p>
@@ -10813,7 +10835,7 @@
           <w:sz w:val="24"/>
           <w:noProof/>
         </w:rPr>
-        <w:t>def test_tc_3_6_status_transition_pending_to_confirmed</w:t>
+        <w:t>def test_tc_3_4_missing_participant_id_returns_400</w:t>
       </w:r>
     </w:p>
     <w:p>
@@ -10830,7 +10852,7 @@
           <w:sz w:val="24"/>
           <w:noProof/>
         </w:rPr>
-        <w:t>def test_tc_3_7_void_with_void_reason_returns_200</w:t>
+        <w:t>def test_tc_3_5_duplicate_participant_date_returns_409</w:t>
       </w:r>
     </w:p>
     <w:p>
@@ -10847,7 +10869,7 @@
           <w:sz w:val="24"/>
           <w:noProof/>
         </w:rPr>
-        <w:t>def test_tc_3_8_void_without_void_reason_returns_422</w:t>
+        <w:t>def test_tc_3_6_status_transition_pending_to_confirmed</w:t>
       </w:r>
     </w:p>
     <w:p>
@@ -10864,7 +10886,7 @@
           <w:sz w:val="24"/>
           <w:noProof/>
         </w:rPr>
-        <w:t>def test_tc_3_9_billing_units_total_hours_to_authorized_units_consumed</w:t>
+        <w:t>def test_tc_3_7_void_with_void_reason_returns_200</w:t>
       </w:r>
     </w:p>
     <w:p>
@@ -10881,7 +10903,7 @@
           <w:sz w:val="24"/>
           <w:noProof/>
         </w:rPr>
-        <w:t>def test_tc_3_10_billed_attendance_cannot_be_modified</w:t>
+        <w:t>def test_tc_3_8_void_without_void_reason_returns_422</w:t>
       </w:r>
     </w:p>
     <w:p>
@@ -10898,7 +10920,7 @@
           <w:sz w:val="24"/>
           <w:noProof/>
         </w:rPr>
-        <w:t>def test_tc_3_11_audit_log_on_creation_has_mandatory_fields_no_phi</w:t>
+        <w:t>def test_tc_3_9_billing_units_total_hours_to_authorized_units_consumed</w:t>
       </w:r>
     </w:p>
     <w:p>
@@ -10915,7 +10937,7 @@
           <w:sz w:val="24"/>
           <w:noProof/>
         </w:rPr>
-        <w:t>def test_tc_3_12_billing_specialist_create_attendance_returns_403</w:t>
+        <w:t>def test_tc_3_10_billed_attendance_cannot_be_modified</w:t>
       </w:r>
     </w:p>
     <w:p>
@@ -10927,22 +10949,12 @@
       <w:r>
         <w:rPr>
           <w:rFonts w:ascii="Calibri" w:hAnsi="Calibri"/>
-          <w:b/>
-          <w:i w:val="0"/>
-          <w:sz w:val="24"/>
-          <w:noProof/>
-        </w:rPr>
-        <w:t>test_claim.py</w:t>
-      </w:r>
-      <w:r>
-        <w:rPr>
-          <w:rFonts w:ascii="Calibri" w:hAnsi="Calibri"/>
           <w:b w:val="0"/>
           <w:i w:val="0"/>
           <w:sz w:val="24"/>
           <w:noProof/>
         </w:rPr>
-        <w:t xml:space="preserve"> - 15 functions (TC-4.1 - TC-4.15)</w:t>
+        <w:t>def test_tc_3_11_audit_log_on_creation_has_mandatory_fields_no_phi</w:t>
       </w:r>
     </w:p>
     <w:p>
@@ -10959,7 +10971,7 @@
           <w:sz w:val="24"/>
           <w:noProof/>
         </w:rPr>
-        <w:t>def test_tc_4_1_duplicate_claim_reference_number_returns_409</w:t>
+        <w:t>def test_tc_3_12_billing_specialist_create_attendance_returns_403</w:t>
       </w:r>
     </w:p>
     <w:p>
@@ -10971,12 +10983,22 @@
       <w:r>
         <w:rPr>
           <w:rFonts w:ascii="Calibri" w:hAnsi="Calibri"/>
+          <w:b/>
+          <w:i w:val="0"/>
+          <w:sz w:val="24"/>
+          <w:noProof/>
+        </w:rPr>
+        <w:t>test_claim.py</w:t>
+      </w:r>
+      <w:r>
+        <w:rPr>
+          <w:rFonts w:ascii="Calibri" w:hAnsi="Calibri"/>
           <w:b w:val="0"/>
           <w:i w:val="0"/>
           <w:sz w:val="24"/>
           <w:noProof/>
         </w:rPr>
-        <w:t>def test_tc_4_2_composite_unique_key_prevents_duplicate_billing</w:t>
+        <w:t xml:space="preserve"> - 15 functions (TC-4.1 - TC-4.15)</w:t>
       </w:r>
     </w:p>
     <w:p>
@@ -10993,7 +11015,7 @@
           <w:sz w:val="24"/>
           <w:noProof/>
         </w:rPr>
-        <w:t>def test_tc_4_3_rbac_unauthorized_roles_return_403_db_count_unchanged</w:t>
+        <w:t>def test_tc_4_1_duplicate_claim_reference_number_returns_409</w:t>
       </w:r>
     </w:p>
     <w:p>
@@ -11010,7 +11032,7 @@
           <w:sz w:val="24"/>
           <w:noProof/>
         </w:rPr>
-        <w:t>def test_tc_4_4_claim_status_immutability_and_transitions</w:t>
+        <w:t>def test_tc_4_2_composite_unique_key_prevents_duplicate_billing</w:t>
       </w:r>
     </w:p>
     <w:p>
@@ -11027,7 +11049,7 @@
           <w:sz w:val="24"/>
           <w:noProof/>
         </w:rPr>
-        <w:t>def test_tc_4_5_claim_requires_confirmed_attendance_records</w:t>
+        <w:t>def test_tc_4_3_rbac_unauthorized_roles_return_403_db_count_unchanged</w:t>
       </w:r>
     </w:p>
     <w:p>
@@ -11044,7 +11066,7 @@
           <w:sz w:val="24"/>
           <w:noProof/>
         </w:rPr>
-        <w:t>def test_tc_4_6_multi_attendance_units_billed_server_calculated</w:t>
+        <w:t>def test_tc_4_4_claim_status_immutability_and_transitions</w:t>
       </w:r>
     </w:p>
     <w:p>
@@ -11061,7 +11083,7 @@
           <w:sz w:val="24"/>
           <w:noProof/>
         </w:rPr>
-        <w:t>def test_tc_4_7_missing_required_fields_return_400_with_field_name</w:t>
+        <w:t>def test_tc_4_5_claim_requires_confirmed_attendance_records</w:t>
       </w:r>
     </w:p>
     <w:p>
@@ -11078,7 +11100,7 @@
           <w:sz w:val="24"/>
           <w:noProof/>
         </w:rPr>
-        <w:t>def test_tc_4_8_audit_log_phi_write_and_phi_disclose_events</w:t>
+        <w:t>def test_tc_4_6_multi_attendance_units_billed_server_calculated</w:t>
       </w:r>
     </w:p>
     <w:p>
@@ -11095,7 +11117,7 @@
           <w:sz w:val="24"/>
           <w:noProof/>
         </w:rPr>
-        <w:t>def test_tc_4_9_empty_attendance_ids_and_server_calculates_units_billed</w:t>
+        <w:t>def test_tc_4_7_missing_required_fields_return_400_with_field_name</w:t>
       </w:r>
     </w:p>
     <w:p>
@@ -11112,7 +11134,7 @@
           <w:sz w:val="24"/>
           <w:noProof/>
         </w:rPr>
-        <w:t>def test_tc_4_10_phase2_fields_rejected_with_400</w:t>
+        <w:t>def test_tc_4_8_audit_log_phi_write_and_phi_disclose_events</w:t>
       </w:r>
     </w:p>
     <w:p>
@@ -11129,7 +11151,7 @@
           <w:sz w:val="24"/>
           <w:noProof/>
         </w:rPr>
-        <w:t>def test_tc_4_11_optimistic_locking_version_conflict_returns_409</w:t>
+        <w:t>def test_tc_4_9_empty_attendance_ids_and_server_calculates_units_billed</w:t>
       </w:r>
     </w:p>
     <w:p>
@@ -11146,7 +11168,7 @@
           <w:sz w:val="24"/>
           <w:noProof/>
         </w:rPr>
-        <w:t>def test_tc_4_12_cross_tenant_attendance_reference_rejected</w:t>
+        <w:t>def test_tc_4_10_phase2_fields_rejected_with_400</w:t>
       </w:r>
     </w:p>
     <w:p>
@@ -11163,7 +11185,7 @@
           <w:sz w:val="24"/>
           <w:noProof/>
         </w:rPr>
-        <w:t>def test_tc_4_13_already_billed_attendance_cannot_be_reclaimed</w:t>
+        <w:t>def test_tc_4_11_optimistic_locking_version_conflict_returns_409</w:t>
       </w:r>
     </w:p>
     <w:p>
@@ -11180,7 +11202,7 @@
           <w:sz w:val="24"/>
           <w:noProof/>
         </w:rPr>
-        <w:t>def test_tc_4_14_get_nonexistent_claim_returns_404</w:t>
+        <w:t>def test_tc_4_12_cross_tenant_attendance_reference_rejected</w:t>
       </w:r>
     </w:p>
     <w:p>
@@ -11197,7 +11219,7 @@
           <w:sz w:val="24"/>
           <w:noProof/>
         </w:rPr>
-        <w:t>def test_tc_4_15_paid_claim_fully_immutable</w:t>
+        <w:t>def test_tc_4_13_already_billed_attendance_cannot_be_reclaimed</w:t>
       </w:r>
     </w:p>
     <w:p>
@@ -11209,22 +11231,12 @@
       <w:r>
         <w:rPr>
           <w:rFonts w:ascii="Calibri" w:hAnsi="Calibri"/>
-          <w:b/>
-          <w:i w:val="0"/>
-          <w:sz w:val="24"/>
-          <w:noProof/>
-        </w:rPr>
-        <w:t>test_mar_record.py</w:t>
-      </w:r>
-      <w:r>
-        <w:rPr>
-          <w:rFonts w:ascii="Calibri" w:hAnsi="Calibri"/>
           <w:b w:val="0"/>
           <w:i w:val="0"/>
           <w:sz w:val="24"/>
           <w:noProof/>
         </w:rPr>
-        <w:t xml:space="preserve"> - 21 functions (TC-5.1 - TC-5.21)</w:t>
+        <w:t>def test_tc_4_14_get_nonexistent_claim_returns_404</w:t>
       </w:r>
     </w:p>
     <w:p>
@@ -11241,7 +11253,7 @@
           <w:sz w:val="24"/>
           <w:noProof/>
         </w:rPr>
-        <w:t>def test_tc_5_1_duplicate_mar_event_returns_409</w:t>
+        <w:t>def test_tc_4_15_paid_claim_fully_immutable</w:t>
       </w:r>
     </w:p>
     <w:p>
@@ -11253,12 +11265,22 @@
       <w:r>
         <w:rPr>
           <w:rFonts w:ascii="Calibri" w:hAnsi="Calibri"/>
+          <w:b/>
+          <w:i w:val="0"/>
+          <w:sz w:val="24"/>
+          <w:noProof/>
+        </w:rPr>
+        <w:t>test_mar_record.py</w:t>
+      </w:r>
+      <w:r>
+        <w:rPr>
+          <w:rFonts w:ascii="Calibri" w:hAnsi="Calibri"/>
           <w:b w:val="0"/>
           <w:i w:val="0"/>
           <w:sz w:val="24"/>
           <w:noProof/>
         </w:rPr>
-        <w:t>def test_tc_5_2_successful_mar_creation_audit_trail</w:t>
+        <w:t xml:space="preserve"> - 21 functions (TC-5.1 - TC-5.21)</w:t>
       </w:r>
     </w:p>
     <w:p>
@@ -11275,7 +11297,7 @@
           <w:sz w:val="24"/>
           <w:noProof/>
         </w:rPr>
-        <w:t>def test_tc_5_3_billing_specialist_cannot_create_mar</w:t>
+        <w:t>def test_tc_5_1_duplicate_mar_event_returns_409</w:t>
       </w:r>
     </w:p>
     <w:p>
@@ -11292,7 +11314,7 @@
           <w:sz w:val="24"/>
           <w:noProof/>
         </w:rPr>
-        <w:t>def test_tc_5_4_controlled_substance_read_denied_for_non_privileged_role</w:t>
+        <w:t>def test_tc_5_2_successful_mar_creation_audit_trail</w:t>
       </w:r>
     </w:p>
     <w:p>
@@ -11309,7 +11331,7 @@
           <w:sz w:val="24"/>
           <w:noProof/>
         </w:rPr>
-        <w:t>def test_tc_5_5_administered_status_requires_administered_time</w:t>
+        <w:t>def test_tc_5_3_billing_specialist_cannot_create_mar</w:t>
       </w:r>
     </w:p>
     <w:p>
@@ -11326,7 +11348,7 @@
           <w:sz w:val="24"/>
           <w:noProof/>
         </w:rPr>
-        <w:t>def test_tc_5_6_controlled_substance_read_allowed_for_privileged_role</w:t>
+        <w:t>def test_tc_5_4_controlled_substance_read_denied_for_non_privileged_role</w:t>
       </w:r>
     </w:p>
     <w:p>
@@ -11343,7 +11365,7 @@
           <w:sz w:val="24"/>
           <w:noProof/>
         </w:rPr>
-        <w:t>def test_tc_5_7_refused_status_requires_notes</w:t>
+        <w:t>def test_tc_5_5_administered_status_requires_administered_time</w:t>
       </w:r>
     </w:p>
     <w:p>
@@ -11360,7 +11382,7 @@
           <w:sz w:val="24"/>
           <w:noProof/>
         </w:rPr>
-        <w:t>def test_tc_5_8_held_status_requires_notes</w:t>
+        <w:t>def test_tc_5_6_controlled_substance_read_allowed_for_privileged_role</w:t>
       </w:r>
     </w:p>
     <w:p>
@@ -11377,7 +11399,7 @@
           <w:sz w:val="24"/>
           <w:noProof/>
         </w:rPr>
-        <w:t>def test_tc_5_9_future_administered_time_rejected</w:t>
+        <w:t>def test_tc_5_7_refused_status_requires_notes</w:t>
       </w:r>
     </w:p>
     <w:p>
@@ -11394,7 +11416,7 @@
           <w:sz w:val="24"/>
           <w:noProof/>
         </w:rPr>
-        <w:t>def test_tc_5_10_administered_time_too_early_rejected</w:t>
+        <w:t>def test_tc_5_8_held_status_requires_notes</w:t>
       </w:r>
     </w:p>
     <w:p>
@@ -11411,7 +11433,7 @@
           <w:sz w:val="24"/>
           <w:noProof/>
         </w:rPr>
-        <w:t>def test_tc_5_11_administered_by_must_be_nurse_role</w:t>
+        <w:t>def test_tc_5_9_future_administered_time_rejected</w:t>
       </w:r>
     </w:p>
     <w:p>
@@ -11428,7 +11450,7 @@
           <w:sz w:val="24"/>
           <w:noProof/>
         </w:rPr>
-        <w:t>def test_tc_5_12_administered_by_user_not_found_rejected</w:t>
+        <w:t>def test_tc_5_10_administered_time_too_early_rejected</w:t>
       </w:r>
     </w:p>
     <w:p>
@@ -11445,7 +11467,7 @@
           <w:sz w:val="24"/>
           <w:noProof/>
         </w:rPr>
-        <w:t>def test_tc_5_13_coordinator_cannot_create_mar</w:t>
+        <w:t>def test_tc_5_11_administered_by_must_be_nurse_role</w:t>
       </w:r>
     </w:p>
     <w:p>
@@ -11462,7 +11484,7 @@
           <w:sz w:val="24"/>
           <w:noProof/>
         </w:rPr>
-        <w:t>def test_tc_5_14_administered_mar_is_immutable</w:t>
+        <w:t>def test_tc_5_12_administered_by_user_not_found_rejected</w:t>
       </w:r>
     </w:p>
     <w:p>
@@ -11479,7 +11501,7 @@
           <w:sz w:val="24"/>
           <w:noProof/>
         </w:rPr>
-        <w:t>def test_tc_5_15_administered_mar_immutable_check_fires_before_version_check</w:t>
+        <w:t>def test_tc_5_13_coordinator_cannot_create_mar</w:t>
       </w:r>
     </w:p>
     <w:p>
@@ -11496,7 +11518,7 @@
           <w:sz w:val="24"/>
           <w:noProof/>
         </w:rPr>
-        <w:t>def test_tc_5_16_patch_notes_on_missed_mar_succeeds</w:t>
+        <w:t>def test_tc_5_14_administered_mar_is_immutable</w:t>
       </w:r>
     </w:p>
     <w:p>
@@ -11513,7 +11535,7 @@
           <w:sz w:val="24"/>
           <w:noProof/>
         </w:rPr>
-        <w:t>def test_tc_5_17_correction_mar_requires_original_mar_id</w:t>
+        <w:t>def test_tc_5_15_administered_mar_immutable_check_fires_before_version_check</w:t>
       </w:r>
     </w:p>
     <w:p>
@@ -11530,7 +11552,7 @@
           <w:sz w:val="24"/>
           <w:noProof/>
         </w:rPr>
-        <w:t>def test_tc_5_18_correction_mar_requires_notes_min_20_chars</w:t>
+        <w:t>def test_tc_5_16_patch_notes_on_missed_mar_succeeds</w:t>
       </w:r>
     </w:p>
     <w:p>
@@ -11547,7 +11569,7 @@
           <w:sz w:val="24"/>
           <w:noProof/>
         </w:rPr>
-        <w:t>def test_tc_5_19_correction_mar_with_valid_fields_succeeds</w:t>
+        <w:t>def test_tc_5_17_correction_mar_requires_original_mar_id</w:t>
       </w:r>
     </w:p>
     <w:p>
@@ -11564,7 +11586,7 @@
           <w:sz w:val="24"/>
           <w:noProof/>
         </w:rPr>
-        <w:t>def test_tc_5_20_patch_missed_mar_status_transition_succeeds</w:t>
+        <w:t>def test_tc_5_18_correction_mar_requires_notes_min_20_chars</w:t>
       </w:r>
     </w:p>
     <w:p>
@@ -11581,7 +11603,7 @@
           <w:sz w:val="24"/>
           <w:noProof/>
         </w:rPr>
-        <w:t>def test_tc_5_21_stale_version_on_missed_mar_returns_version_conflict</w:t>
+        <w:t>def test_tc_5_19_correction_mar_with_valid_fields_succeeds</w:t>
       </w:r>
     </w:p>
     <w:p>
@@ -11593,22 +11615,12 @@
       <w:r>
         <w:rPr>
           <w:rFonts w:ascii="Calibri" w:hAnsi="Calibri"/>
-          <w:b/>
-          <w:i w:val="0"/>
-          <w:sz w:val="24"/>
-          <w:noProof/>
-        </w:rPr>
-        <w:t>test_incident.py</w:t>
-      </w:r>
-      <w:r>
-        <w:rPr>
-          <w:rFonts w:ascii="Calibri" w:hAnsi="Calibri"/>
           <w:b w:val="0"/>
           <w:i w:val="0"/>
           <w:sz w:val="24"/>
           <w:noProof/>
         </w:rPr>
-        <w:t xml:space="preserve"> - 15 functions (TC-6.1 - TC-6.15)</w:t>
+        <w:t>def test_tc_5_20_patch_missed_mar_status_transition_succeeds</w:t>
       </w:r>
     </w:p>
     <w:p>
@@ -11625,7 +11637,7 @@
           <w:sz w:val="24"/>
           <w:noProof/>
         </w:rPr>
-        <w:t>def test_tc_6_1_successful_incident_creation_audit_trail</w:t>
+        <w:t>def test_tc_5_21_stale_version_on_missed_mar_returns_version_conflict</w:t>
       </w:r>
     </w:p>
     <w:p>
@@ -11637,12 +11649,22 @@
       <w:r>
         <w:rPr>
           <w:rFonts w:ascii="Calibri" w:hAnsi="Calibri"/>
+          <w:b/>
+          <w:i w:val="0"/>
+          <w:sz w:val="24"/>
+          <w:noProof/>
+        </w:rPr>
+        <w:t>test_incident.py</w:t>
+      </w:r>
+      <w:r>
+        <w:rPr>
+          <w:rFonts w:ascii="Calibri" w:hAnsi="Calibri"/>
           <w:b w:val="0"/>
           <w:i w:val="0"/>
           <w:sz w:val="24"/>
           <w:noProof/>
         </w:rPr>
-        <w:t>def test_tc_6_2_admin_and_coordinator_can_create_incident</w:t>
+        <w:t xml:space="preserve"> - 15 functions (TC-6.1 - TC-6.15)</w:t>
       </w:r>
     </w:p>
     <w:p>
@@ -11659,7 +11681,7 @@
           <w:sz w:val="24"/>
           <w:noProof/>
         </w:rPr>
-        <w:t>def test_tc_6_3_physician_cannot_create_incident</w:t>
+        <w:t>def test_tc_6_1_successful_incident_creation_audit_trail</w:t>
       </w:r>
     </w:p>
     <w:p>
@@ -11676,7 +11698,7 @@
           <w:sz w:val="24"/>
           <w:noProof/>
         </w:rPr>
-        <w:t>def test_tc_6_4_physician_cannot_read_any_incident</w:t>
+        <w:t>def test_tc_6_2_admin_and_coordinator_can_create_incident</w:t>
       </w:r>
     </w:p>
     <w:p>
@@ -11693,7 +11715,7 @@
           <w:sz w:val="24"/>
           <w:noProof/>
         </w:rPr>
-        <w:t>def test_tc_6_5_billing_specialist_read_sud_incident_denied_with_audit</w:t>
+        <w:t>def test_tc_6_3_physician_cannot_create_incident</w:t>
       </w:r>
     </w:p>
     <w:p>
@@ -11710,7 +11732,7 @@
           <w:sz w:val="24"/>
           <w:noProof/>
         </w:rPr>
-        <w:t>def test_tc_6_6_medical_emergency_incident_auto_escalates</w:t>
+        <w:t>def test_tc_6_4_physician_cannot_read_any_incident</w:t>
       </w:r>
     </w:p>
     <w:p>
@@ -11727,7 +11749,7 @@
           <w:sz w:val="24"/>
           <w:noProof/>
         </w:rPr>
-        <w:t>def test_tc_6_7_coordinator_can_read_sud_incident</w:t>
+        <w:t>def test_tc_6_5_billing_specialist_read_sud_incident_denied_with_audit</w:t>
       </w:r>
     </w:p>
     <w:p>
@@ -11744,7 +11766,7 @@
           <w:sz w:val="24"/>
           <w:noProof/>
         </w:rPr>
-        <w:t>def test_tc_6_8_closed_incident_is_immutable</w:t>
+        <w:t>def test_tc_6_6_medical_emergency_incident_auto_escalates</w:t>
       </w:r>
     </w:p>
     <w:p>
@@ -11761,7 +11783,7 @@
           <w:sz w:val="24"/>
           <w:noProof/>
         </w:rPr>
-        <w:t>def test_tc_6_9_severe_incident_auto_escalates</w:t>
+        <w:t>def test_tc_6_7_coordinator_can_read_sud_incident</w:t>
       </w:r>
     </w:p>
     <w:p>
@@ -11778,7 +11800,7 @@
           <w:sz w:val="24"/>
           <w:noProof/>
         </w:rPr>
-        <w:t>def test_tc_6_10_escalation_alert_job_emits_escalation_alert_audit</w:t>
+        <w:t>def test_tc_6_8_closed_incident_is_immutable</w:t>
       </w:r>
     </w:p>
     <w:p>
@@ -11795,7 +11817,7 @@
           <w:sz w:val="24"/>
           <w:noProof/>
         </w:rPr>
-        <w:t>def test_tc_6_11_addendum_incident_links_to_original_incident</w:t>
+        <w:t>def test_tc_6_9_severe_incident_auto_escalates</w:t>
       </w:r>
     </w:p>
     <w:p>
@@ -11812,7 +11834,7 @@
           <w:sz w:val="24"/>
           <w:noProof/>
         </w:rPr>
-        <w:t>def test_tc_6_12_closed_incident_immutable_check_fires_before_version_check</w:t>
+        <w:t>def test_tc_6_10_escalation_alert_job_emits_escalation_alert_audit</w:t>
       </w:r>
     </w:p>
     <w:p>
@@ -11829,7 +11851,7 @@
           <w:sz w:val="24"/>
           <w:noProof/>
         </w:rPr>
-        <w:t>def test_tc_6_13_escalated_to_closed_requires_regulatory_submission_date</w:t>
+        <w:t>def test_tc_6_11_addendum_incident_links_to_original_incident</w:t>
       </w:r>
     </w:p>
     <w:p>
@@ -11846,7 +11868,7 @@
           <w:sz w:val="24"/>
           <w:noProof/>
         </w:rPr>
-        <w:t>def test_tc_6_14_stale_version_on_incident_returns_version_conflict</w:t>
+        <w:t>def test_tc_6_12_closed_incident_immutable_check_fires_before_version_check</w:t>
       </w:r>
     </w:p>
     <w:p>
@@ -11863,7 +11885,7 @@
           <w:sz w:val="24"/>
           <w:noProof/>
         </w:rPr>
-        <w:t>def test_tc_6_15_closed_incident_patch_any_field_returns_immutable</w:t>
+        <w:t>def test_tc_6_13_escalated_to_closed_requires_regulatory_submission_date</w:t>
       </w:r>
     </w:p>
     <w:p>
@@ -11875,22 +11897,12 @@
       <w:r>
         <w:rPr>
           <w:rFonts w:ascii="Calibri" w:hAnsi="Calibri"/>
-          <w:b/>
-          <w:i w:val="0"/>
-          <w:sz w:val="24"/>
-          <w:noProof/>
-        </w:rPr>
-        <w:t>test_audit_log.py</w:t>
-      </w:r>
-      <w:r>
-        <w:rPr>
-          <w:rFonts w:ascii="Calibri" w:hAnsi="Calibri"/>
           <w:b w:val="0"/>
           <w:i w:val="0"/>
           <w:sz w:val="24"/>
           <w:noProof/>
         </w:rPr>
-        <w:t xml:space="preserve"> - cross-entity: verifies audit pipeline completeness across all six entities (regulatory gate)</w:t>
+        <w:t>def test_tc_6_14_stale_version_on_incident_returns_version_conflict</w:t>
       </w:r>
     </w:p>
     <w:p>
@@ -11902,22 +11914,12 @@
       <w:r>
         <w:rPr>
           <w:rFonts w:ascii="Calibri" w:hAnsi="Calibri"/>
-          <w:b/>
-          <w:i w:val="0"/>
-          <w:sz w:val="24"/>
-          <w:noProof/>
-        </w:rPr>
-        <w:t>test_rbac_sweep.py</w:t>
-      </w:r>
-      <w:r>
-        <w:rPr>
-          <w:rFonts w:ascii="Calibri" w:hAnsi="Calibri"/>
           <w:b w:val="0"/>
           <w:i w:val="0"/>
           <w:sz w:val="24"/>
           <w:noProof/>
         </w:rPr>
-        <w:t xml:space="preserve"> - cross-entity: parametrized matrix of all roles against all entity endpoints (security gate)</w:t>
+        <w:t>def test_tc_6_15_closed_incident_patch_any_field_returns_immutable</w:t>
       </w:r>
     </w:p>
     <w:p>
@@ -11934,6 +11936,434 @@
           <w:sz w:val="24"/>
           <w:noProof/>
         </w:rPr>
+        <w:t>test_audit_log.py</w:t>
+      </w:r>
+      <w:r>
+        <w:rPr>
+          <w:rFonts w:ascii="Calibri" w:hAnsi="Calibri"/>
+          <w:b w:val="0"/>
+          <w:i w:val="0"/>
+          <w:sz w:val="24"/>
+          <w:noProof/>
+        </w:rPr>
+        <w:t xml:space="preserve"> - 10 functions (TC-7.1 - TC-7.10)</w:t>
+      </w:r>
+    </w:p>
+    <w:p>
+      <w:pPr>
+        <w:spacing w:before="0" w:after="0" w:line="240" w:lineRule="auto"/>
+        <w:ind w:left="0" w:firstLine="0"/>
+        <w:suppressAutoHyphens/>
+      </w:pPr>
+      <w:r>
+        <w:rPr>
+          <w:rFonts w:ascii="Calibri" w:hAnsi="Calibri"/>
+          <w:b w:val="0"/>
+          <w:i w:val="0"/>
+          <w:sz w:val="24"/>
+          <w:noProof/>
+        </w:rPr>
+        <w:t>def test_tc_7_1_audit_mandatory_fields_present_on_participant_write</w:t>
+      </w:r>
+    </w:p>
+    <w:p>
+      <w:pPr>
+        <w:spacing w:before="0" w:after="0" w:line="240" w:lineRule="auto"/>
+        <w:ind w:left="0" w:firstLine="0"/>
+        <w:suppressAutoHyphens/>
+      </w:pPr>
+      <w:r>
+        <w:rPr>
+          <w:rFonts w:ascii="Calibri" w:hAnsi="Calibri"/>
+          <w:b w:val="0"/>
+          <w:i w:val="0"/>
+          <w:sz w:val="24"/>
+          <w:noProof/>
+        </w:rPr>
+        <w:t>def test_tc_7_2_unauthorized_role_denied_write_phi_resource_access_denied_audit_logged</w:t>
+      </w:r>
+    </w:p>
+    <w:p>
+      <w:pPr>
+        <w:spacing w:before="0" w:after="0" w:line="240" w:lineRule="auto"/>
+        <w:ind w:left="0" w:firstLine="0"/>
+        <w:suppressAutoHyphens/>
+      </w:pPr>
+      <w:r>
+        <w:rPr>
+          <w:rFonts w:ascii="Calibri" w:hAnsi="Calibri"/>
+          <w:b w:val="0"/>
+          <w:i w:val="0"/>
+          <w:sz w:val="24"/>
+          <w:noProof/>
+        </w:rPr>
+        <w:t>def test_tc_7_3_audit_mandatory_fields_present_on_mar_controlled_substance_read</w:t>
+      </w:r>
+    </w:p>
+    <w:p>
+      <w:pPr>
+        <w:spacing w:before="0" w:after="0" w:line="240" w:lineRule="auto"/>
+        <w:ind w:left="0" w:firstLine="0"/>
+        <w:suppressAutoHyphens/>
+      </w:pPr>
+      <w:r>
+        <w:rPr>
+          <w:rFonts w:ascii="Calibri" w:hAnsi="Calibri"/>
+          <w:b w:val="0"/>
+          <w:i w:val="0"/>
+          <w:sz w:val="24"/>
+          <w:noProof/>
+        </w:rPr>
+        <w:t>def test_tc_7_4_phi_values_absent_from_audit_log_payloads_across_all_entities</w:t>
+      </w:r>
+    </w:p>
+    <w:p>
+      <w:pPr>
+        <w:spacing w:before="0" w:after="0" w:line="240" w:lineRule="auto"/>
+        <w:ind w:left="0" w:firstLine="0"/>
+        <w:suppressAutoHyphens/>
+      </w:pPr>
+      <w:r>
+        <w:rPr>
+          <w:rFonts w:ascii="Calibri" w:hAnsi="Calibri"/>
+          <w:b w:val="0"/>
+          <w:i w:val="0"/>
+          <w:sz w:val="24"/>
+          <w:noProof/>
+        </w:rPr>
+        <w:t>def test_tc_7_5_access_denied_audit_event_logged_for_every_403_response</w:t>
+      </w:r>
+    </w:p>
+    <w:p>
+      <w:pPr>
+        <w:spacing w:before="0" w:after="0" w:line="240" w:lineRule="auto"/>
+        <w:ind w:left="0" w:firstLine="0"/>
+        <w:suppressAutoHyphens/>
+      </w:pPr>
+      <w:r>
+        <w:rPr>
+          <w:rFonts w:ascii="Calibri" w:hAnsi="Calibri"/>
+          <w:b w:val="0"/>
+          <w:i w:val="0"/>
+          <w:sz w:val="24"/>
+          <w:noProof/>
+        </w:rPr>
+        <w:t>def test_tc_7_6_audit_row_exists_in_db_after_api_call_completes</w:t>
+      </w:r>
+    </w:p>
+    <w:p>
+      <w:pPr>
+        <w:spacing w:before="0" w:after="0" w:line="240" w:lineRule="auto"/>
+        <w:ind w:left="0" w:firstLine="0"/>
+        <w:suppressAutoHyphens/>
+      </w:pPr>
+      <w:r>
+        <w:rPr>
+          <w:rFonts w:ascii="Calibri" w:hAnsi="Calibri"/>
+          <w:b w:val="0"/>
+          <w:i w:val="0"/>
+          <w:sz w:val="24"/>
+          <w:noProof/>
+        </w:rPr>
+        <w:t>def test_tc_7_7_claim_submission_produces_phi_disclose_audit_event</w:t>
+      </w:r>
+    </w:p>
+    <w:p>
+      <w:pPr>
+        <w:spacing w:before="0" w:after="0" w:line="240" w:lineRule="auto"/>
+        <w:ind w:left="0" w:firstLine="0"/>
+        <w:suppressAutoHyphens/>
+      </w:pPr>
+      <w:r>
+        <w:rPr>
+          <w:rFonts w:ascii="Calibri" w:hAnsi="Calibri"/>
+          <w:b w:val="0"/>
+          <w:i w:val="0"/>
+          <w:sz w:val="24"/>
+          <w:noProof/>
+        </w:rPr>
+        <w:t>def test_tc_7_8_sud_related_incident_write_produces_separate_audit_event</w:t>
+      </w:r>
+    </w:p>
+    <w:p>
+      <w:pPr>
+        <w:spacing w:before="0" w:after="0" w:line="240" w:lineRule="auto"/>
+        <w:ind w:left="0" w:firstLine="0"/>
+        <w:suppressAutoHyphens/>
+      </w:pPr>
+      <w:r>
+        <w:rPr>
+          <w:rFonts w:ascii="Calibri" w:hAnsi="Calibri"/>
+          <w:b w:val="0"/>
+          <w:i w:val="0"/>
+          <w:sz w:val="24"/>
+          <w:noProof/>
+        </w:rPr>
+        <w:t>def test_tc_7_9_claim_audit_events_carry_10_year_retention_marker</w:t>
+      </w:r>
+    </w:p>
+    <w:p>
+      <w:pPr>
+        <w:spacing w:before="0" w:after="0" w:line="240" w:lineRule="auto"/>
+        <w:ind w:left="0" w:firstLine="0"/>
+        <w:suppressAutoHyphens/>
+      </w:pPr>
+      <w:r>
+        <w:rPr>
+          <w:rFonts w:ascii="Calibri" w:hAnsi="Calibri"/>
+          <w:b w:val="0"/>
+          <w:i w:val="0"/>
+          <w:sz w:val="24"/>
+          <w:noProof/>
+        </w:rPr>
+        <w:t>def test_tc_7_10_audit_log_rows_contain_no_raw_phi_field_values</w:t>
+      </w:r>
+    </w:p>
+    <w:p>
+      <w:pPr>
+        <w:spacing w:before="0" w:after="0" w:line="240" w:lineRule="auto"/>
+        <w:ind w:left="0" w:firstLine="0"/>
+        <w:suppressAutoHyphens/>
+      </w:pPr>
+      <w:r>
+        <w:rPr>
+          <w:rFonts w:ascii="Calibri" w:hAnsi="Calibri"/>
+          <w:b/>
+          <w:i w:val="0"/>
+          <w:sz w:val="24"/>
+          <w:noProof/>
+        </w:rPr>
+        <w:t>test_rbac_sweep.py</w:t>
+      </w:r>
+      <w:r>
+        <w:rPr>
+          <w:rFonts w:ascii="Calibri" w:hAnsi="Calibri"/>
+          <w:b w:val="0"/>
+          <w:i w:val="0"/>
+          <w:sz w:val="24"/>
+          <w:noProof/>
+        </w:rPr>
+        <w:t xml:space="preserve"> - 12 functions (TC-8.1 - TC-8.12)</w:t>
+      </w:r>
+    </w:p>
+    <w:p>
+      <w:pPr>
+        <w:spacing w:before="0" w:after="0" w:line="240" w:lineRule="auto"/>
+        <w:ind w:left="0" w:firstLine="0"/>
+        <w:suppressAutoHyphens/>
+      </w:pPr>
+      <w:r>
+        <w:rPr>
+          <w:rFonts w:ascii="Calibri" w:hAnsi="Calibri"/>
+          <w:b w:val="0"/>
+          <w:i w:val="0"/>
+          <w:sz w:val="24"/>
+          <w:noProof/>
+        </w:rPr>
+        <w:t>def test_tc_8_1_program_administrator_write_permitted_on_attendance_and_claims</w:t>
+      </w:r>
+    </w:p>
+    <w:p>
+      <w:pPr>
+        <w:spacing w:before="0" w:after="0" w:line="240" w:lineRule="auto"/>
+        <w:ind w:left="0" w:firstLine="0"/>
+        <w:suppressAutoHyphens/>
+      </w:pPr>
+      <w:r>
+        <w:rPr>
+          <w:rFonts w:ascii="Calibri" w:hAnsi="Calibri"/>
+          <w:b w:val="0"/>
+          <w:i w:val="0"/>
+          <w:sz w:val="24"/>
+          <w:noProof/>
+        </w:rPr>
+        <w:t>def test_tc_8_2_care_coordinator_write_permitted_on_attendance_and_incidents</w:t>
+      </w:r>
+    </w:p>
+    <w:p>
+      <w:pPr>
+        <w:spacing w:before="0" w:after="0" w:line="240" w:lineRule="auto"/>
+        <w:ind w:left="0" w:firstLine="0"/>
+        <w:suppressAutoHyphens/>
+      </w:pPr>
+      <w:r>
+        <w:rPr>
+          <w:rFonts w:ascii="Calibri" w:hAnsi="Calibri"/>
+          <w:b w:val="0"/>
+          <w:i w:val="0"/>
+          <w:sz w:val="24"/>
+          <w:noProof/>
+        </w:rPr>
+        <w:t>def test_tc_8_3_nurse_medication_aide_write_permitted_on_mar_record_only</w:t>
+      </w:r>
+    </w:p>
+    <w:p>
+      <w:pPr>
+        <w:spacing w:before="0" w:after="0" w:line="240" w:lineRule="auto"/>
+        <w:ind w:left="0" w:firstLine="0"/>
+        <w:suppressAutoHyphens/>
+      </w:pPr>
+      <w:r>
+        <w:rPr>
+          <w:rFonts w:ascii="Calibri" w:hAnsi="Calibri"/>
+          <w:b w:val="0"/>
+          <w:i w:val="0"/>
+          <w:sz w:val="24"/>
+          <w:noProof/>
+        </w:rPr>
+        <w:t>def test_tc_8_4_billing_specialist_write_permitted_on_claims_only</w:t>
+      </w:r>
+    </w:p>
+    <w:p>
+      <w:pPr>
+        <w:spacing w:before="0" w:after="0" w:line="240" w:lineRule="auto"/>
+        <w:ind w:left="0" w:firstLine="0"/>
+        <w:suppressAutoHyphens/>
+      </w:pPr>
+      <w:r>
+        <w:rPr>
+          <w:rFonts w:ascii="Calibri" w:hAnsi="Calibri"/>
+          <w:b w:val="0"/>
+          <w:i w:val="0"/>
+          <w:sz w:val="24"/>
+          <w:noProof/>
+        </w:rPr>
+        <w:t>def test_tc_8_5_physician_denied_write_on_participant_endpoint</w:t>
+      </w:r>
+    </w:p>
+    <w:p>
+      <w:pPr>
+        <w:spacing w:before="0" w:after="0" w:line="240" w:lineRule="auto"/>
+        <w:ind w:left="0" w:firstLine="0"/>
+        <w:suppressAutoHyphens/>
+      </w:pPr>
+      <w:r>
+        <w:rPr>
+          <w:rFonts w:ascii="Calibri" w:hAnsi="Calibri"/>
+          <w:b w:val="0"/>
+          <w:i w:val="0"/>
+          <w:sz w:val="24"/>
+          <w:noProof/>
+        </w:rPr>
+        <w:t>def test_tc_8_6_physician_denied_write_on_user_endpoint</w:t>
+      </w:r>
+    </w:p>
+    <w:p>
+      <w:pPr>
+        <w:spacing w:before="0" w:after="0" w:line="240" w:lineRule="auto"/>
+        <w:ind w:left="0" w:firstLine="0"/>
+        <w:suppressAutoHyphens/>
+      </w:pPr>
+      <w:r>
+        <w:rPr>
+          <w:rFonts w:ascii="Calibri" w:hAnsi="Calibri"/>
+          <w:b w:val="0"/>
+          <w:i w:val="0"/>
+          <w:sz w:val="24"/>
+          <w:noProof/>
+        </w:rPr>
+        <w:t>def test_tc_8_7_physician_denied_write_on_attendance_endpoint</w:t>
+      </w:r>
+    </w:p>
+    <w:p>
+      <w:pPr>
+        <w:spacing w:before="0" w:after="0" w:line="240" w:lineRule="auto"/>
+        <w:ind w:left="0" w:firstLine="0"/>
+        <w:suppressAutoHyphens/>
+      </w:pPr>
+      <w:r>
+        <w:rPr>
+          <w:rFonts w:ascii="Calibri" w:hAnsi="Calibri"/>
+          <w:b w:val="0"/>
+          <w:i w:val="0"/>
+          <w:sz w:val="24"/>
+          <w:noProof/>
+        </w:rPr>
+        <w:t>def test_tc_8_8_physician_denied_write_on_claim_endpoint</w:t>
+      </w:r>
+    </w:p>
+    <w:p>
+      <w:pPr>
+        <w:spacing w:before="0" w:after="0" w:line="240" w:lineRule="auto"/>
+        <w:ind w:left="0" w:firstLine="0"/>
+        <w:suppressAutoHyphens/>
+      </w:pPr>
+      <w:r>
+        <w:rPr>
+          <w:rFonts w:ascii="Calibri" w:hAnsi="Calibri"/>
+          <w:b w:val="0"/>
+          <w:i w:val="0"/>
+          <w:sz w:val="24"/>
+          <w:noProof/>
+        </w:rPr>
+        <w:t>def test_tc_8_9_physician_denied_write_on_mar_record_endpoint</w:t>
+      </w:r>
+    </w:p>
+    <w:p>
+      <w:pPr>
+        <w:spacing w:before="0" w:after="0" w:line="240" w:lineRule="auto"/>
+        <w:ind w:left="0" w:firstLine="0"/>
+        <w:suppressAutoHyphens/>
+      </w:pPr>
+      <w:r>
+        <w:rPr>
+          <w:rFonts w:ascii="Calibri" w:hAnsi="Calibri"/>
+          <w:b w:val="0"/>
+          <w:i w:val="0"/>
+          <w:sz w:val="24"/>
+          <w:noProof/>
+        </w:rPr>
+        <w:t>def test_tc_8_10_physician_denied_write_on_incident_endpoint</w:t>
+      </w:r>
+    </w:p>
+    <w:p>
+      <w:pPr>
+        <w:spacing w:before="0" w:after="0" w:line="240" w:lineRule="auto"/>
+        <w:ind w:left="0" w:firstLine="0"/>
+        <w:suppressAutoHyphens/>
+      </w:pPr>
+      <w:r>
+        <w:rPr>
+          <w:rFonts w:ascii="Calibri" w:hAnsi="Calibri"/>
+          <w:b w:val="0"/>
+          <w:i w:val="0"/>
+          <w:sz w:val="24"/>
+          <w:noProof/>
+        </w:rPr>
+        <w:t>def test_tc_8_11_participant_family_denied_all_staff_entity_endpoints</w:t>
+      </w:r>
+    </w:p>
+    <w:p>
+      <w:pPr>
+        <w:spacing w:before="0" w:after="0" w:line="240" w:lineRule="auto"/>
+        <w:ind w:left="0" w:firstLine="0"/>
+        <w:suppressAutoHyphens/>
+      </w:pPr>
+      <w:r>
+        <w:rPr>
+          <w:rFonts w:ascii="Calibri" w:hAnsi="Calibri"/>
+          <w:b w:val="0"/>
+          <w:i w:val="0"/>
+          <w:sz w:val="24"/>
+          <w:noProof/>
+        </w:rPr>
+        <w:t>def test_tc_8_12_compliance_officer_read_permitted_on_all_entities</w:t>
+      </w:r>
+    </w:p>
+    <w:p>
+      <w:pPr>
+        <w:spacing w:before="0" w:after="0" w:line="240" w:lineRule="auto"/>
+        <w:ind w:left="0" w:firstLine="0"/>
+        <w:suppressAutoHyphens/>
+      </w:pPr>
+      <w:r>
+        <w:rPr>
+          <w:rFonts w:ascii="Calibri" w:hAnsi="Calibri"/>
+          <w:b/>
+          <w:i w:val="0"/>
+          <w:sz w:val="24"/>
+          <w:noProof/>
+        </w:rPr>
         <w:t>test_tenant_isolation.py</w:t>
       </w:r>
       <w:r>
@@ -11944,7 +12374,126 @@
           <w:sz w:val="24"/>
           <w:noProof/>
         </w:rPr>
-        <w:t xml:space="preserve"> - cross-entity: verifies no record from tenant A is accessible to tenant B users (security gate)</w:t>
+        <w:t xml:space="preserve"> - 7 functions (TC-9.1 - TC-9.7)</w:t>
+      </w:r>
+    </w:p>
+    <w:p>
+      <w:pPr>
+        <w:spacing w:before="0" w:after="0" w:line="240" w:lineRule="auto"/>
+        <w:ind w:left="0" w:firstLine="0"/>
+        <w:suppressAutoHyphens/>
+      </w:pPr>
+      <w:r>
+        <w:rPr>
+          <w:rFonts w:ascii="Calibri" w:hAnsi="Calibri"/>
+          <w:b w:val="0"/>
+          <w:i w:val="0"/>
+          <w:sz w:val="24"/>
+          <w:noProof/>
+        </w:rPr>
+        <w:t>def test_tc_9_1_participant_not_accessible_from_other_tenant</w:t>
+      </w:r>
+    </w:p>
+    <w:p>
+      <w:pPr>
+        <w:spacing w:before="0" w:after="0" w:line="240" w:lineRule="auto"/>
+        <w:ind w:left="0" w:firstLine="0"/>
+        <w:suppressAutoHyphens/>
+      </w:pPr>
+      <w:r>
+        <w:rPr>
+          <w:rFonts w:ascii="Calibri" w:hAnsi="Calibri"/>
+          <w:b w:val="0"/>
+          <w:i w:val="0"/>
+          <w:sz w:val="24"/>
+          <w:noProof/>
+        </w:rPr>
+        <w:t>def test_tc_9_2_user_token_rejected_on_other_tenant_endpoints</w:t>
+      </w:r>
+    </w:p>
+    <w:p>
+      <w:pPr>
+        <w:spacing w:before="0" w:after="0" w:line="240" w:lineRule="auto"/>
+        <w:ind w:left="0" w:firstLine="0"/>
+        <w:suppressAutoHyphens/>
+      </w:pPr>
+      <w:r>
+        <w:rPr>
+          <w:rFonts w:ascii="Calibri" w:hAnsi="Calibri"/>
+          <w:b w:val="0"/>
+          <w:i w:val="0"/>
+          <w:sz w:val="24"/>
+          <w:noProof/>
+        </w:rPr>
+        <w:t>def test_tc_9_3_attendance_not_accessible_from_other_tenant</w:t>
+      </w:r>
+    </w:p>
+    <w:p>
+      <w:pPr>
+        <w:spacing w:before="0" w:after="0" w:line="240" w:lineRule="auto"/>
+        <w:ind w:left="0" w:firstLine="0"/>
+        <w:suppressAutoHyphens/>
+      </w:pPr>
+      <w:r>
+        <w:rPr>
+          <w:rFonts w:ascii="Calibri" w:hAnsi="Calibri"/>
+          <w:b w:val="0"/>
+          <w:i w:val="0"/>
+          <w:sz w:val="24"/>
+          <w:noProof/>
+        </w:rPr>
+        <w:t>def test_tc_9_4_claim_not_accessible_from_other_tenant</w:t>
+      </w:r>
+    </w:p>
+    <w:p>
+      <w:pPr>
+        <w:spacing w:before="0" w:after="0" w:line="240" w:lineRule="auto"/>
+        <w:ind w:left="0" w:firstLine="0"/>
+        <w:suppressAutoHyphens/>
+      </w:pPr>
+      <w:r>
+        <w:rPr>
+          <w:rFonts w:ascii="Calibri" w:hAnsi="Calibri"/>
+          <w:b w:val="0"/>
+          <w:i w:val="0"/>
+          <w:sz w:val="24"/>
+          <w:noProof/>
+        </w:rPr>
+        <w:t>def test_tc_9_5_mar_record_not_accessible_from_other_tenant</w:t>
+      </w:r>
+    </w:p>
+    <w:p>
+      <w:pPr>
+        <w:spacing w:before="0" w:after="0" w:line="240" w:lineRule="auto"/>
+        <w:ind w:left="0" w:firstLine="0"/>
+        <w:suppressAutoHyphens/>
+      </w:pPr>
+      <w:r>
+        <w:rPr>
+          <w:rFonts w:ascii="Calibri" w:hAnsi="Calibri"/>
+          <w:b w:val="0"/>
+          <w:i w:val="0"/>
+          <w:sz w:val="24"/>
+          <w:noProof/>
+        </w:rPr>
+        <w:t>def test_tc_9_6_incident_not_accessible_from_other_tenant</w:t>
+      </w:r>
+    </w:p>
+    <w:p>
+      <w:pPr>
+        <w:spacing w:before="0" w:after="0" w:line="240" w:lineRule="auto"/>
+        <w:ind w:left="0" w:firstLine="0"/>
+        <w:suppressAutoHyphens/>
+      </w:pPr>
+      <w:r>
+        <w:rPr>
+          <w:rFonts w:ascii="Calibri" w:hAnsi="Calibri"/>
+          <w:b w:val="0"/>
+          <w:i w:val="0"/>
+          <w:sz w:val="24"/>
+          <w:noProof/>
+        </w:rPr>
+        <w:t>def test_tc_9_7_unique_constraints_are_scoped_per_tenant</w:t>
       </w:r>
     </w:p>
     <w:p>

</xml_diff>